<commit_message>
Ajout authentification, et mise à jours des fichiers
</commit_message>
<xml_diff>
--- a/1_Cahier_des_charges_MiniGarage.docx
+++ b/1_Cahier_des_charges_MiniGarage.docx
@@ -600,6 +600,86 @@
     </w:p>
     <w:p>
       <w:pPr>
+        <w:pStyle w:val="Paragraphedeliste"/>
+        <w:rPr>
+          <w:sz w:val="24"/>
+          <w:szCs w:val="24"/>
+        </w:rPr>
+      </w:pPr>
+      <w:r>
+        <w:rPr>
+          <w:sz w:val="24"/>
+          <w:szCs w:val="24"/>
+        </w:rPr>
+        <w:t xml:space="preserve">Authentification de l'administrateur (connexion par </w:t>
+      </w:r>
+      <w:proofErr w:type="gramStart"/>
+      <w:r>
+        <w:rPr>
+          <w:sz w:val="24"/>
+          <w:szCs w:val="24"/>
+        </w:rPr>
+        <w:t>email</w:t>
+      </w:r>
+      <w:proofErr w:type="gramEnd"/>
+      <w:r>
+        <w:rPr>
+          <w:sz w:val="24"/>
+          <w:szCs w:val="24"/>
+        </w:rPr>
+        <w:t xml:space="preserve"> / mot de passe, </w:t>
+      </w:r>
+      <w:proofErr w:type="spellStart"/>
+      <w:r>
+        <w:rPr>
+          <w:sz w:val="24"/>
+          <w:szCs w:val="24"/>
+        </w:rPr>
+        <w:t>token</w:t>
+      </w:r>
+      <w:proofErr w:type="spellEnd"/>
+      <w:r>
+        <w:rPr>
+          <w:sz w:val="24"/>
+          <w:szCs w:val="24"/>
+        </w:rPr>
+        <w:t xml:space="preserve"> API </w:t>
+      </w:r>
+      <w:proofErr w:type="spellStart"/>
+      <w:r>
+        <w:rPr>
+          <w:sz w:val="24"/>
+          <w:szCs w:val="24"/>
+        </w:rPr>
+        <w:t>Laravel</w:t>
+      </w:r>
+      <w:proofErr w:type="spellEnd"/>
+      <w:r>
+        <w:rPr>
+          <w:sz w:val="24"/>
+          <w:szCs w:val="24"/>
+        </w:rPr>
+        <w:t xml:space="preserve"> </w:t>
+      </w:r>
+      <w:proofErr w:type="spellStart"/>
+      <w:r>
+        <w:rPr>
+          <w:sz w:val="24"/>
+          <w:szCs w:val="24"/>
+        </w:rPr>
+        <w:t>Sanctum</w:t>
+      </w:r>
+      <w:proofErr w:type="spellEnd"/>
+      <w:r>
+        <w:rPr>
+          <w:sz w:val="24"/>
+          <w:szCs w:val="24"/>
+        </w:rPr>
+        <w:t>) protégeant l'accès à l'ensemble de l'application.</w:t>
+      </w:r>
+    </w:p>
+    <w:p>
+      <w:pPr>
         <w:spacing w:before="120" w:after="120"/>
         <w:rPr>
           <w:b/>
@@ -637,7 +717,7 @@
           <w:sz w:val="24"/>
           <w:szCs w:val="24"/>
         </w:rPr>
-        <w:t>Authentification et gestion de comptes utilisateurs (rôles, connexion/déconnexion).</w:t>
+        <w:t>Facturation et gestion des paiements.</w:t>
       </w:r>
     </w:p>
     <w:p>
@@ -658,7 +738,7 @@
           <w:sz w:val="24"/>
           <w:szCs w:val="24"/>
         </w:rPr>
-        <w:t>Facturation et gestion des paiements.</w:t>
+        <w:t>Gestion des stocks de pièces détachées.</w:t>
       </w:r>
     </w:p>
     <w:p>
@@ -679,7 +759,7 @@
           <w:sz w:val="24"/>
           <w:szCs w:val="24"/>
         </w:rPr>
-        <w:t>Gestion des stocks de pièces détachées.</w:t>
+        <w:t>Notifications automatiques (rappels d'entretien, alertes).</w:t>
       </w:r>
     </w:p>
     <w:p>
@@ -700,27 +780,7 @@
           <w:sz w:val="24"/>
           <w:szCs w:val="24"/>
         </w:rPr>
-        <w:t>Notifications automatiques (rappels d'entretien, alertes).</w:t>
-      </w:r>
-    </w:p>
-    <w:p>
-      <w:pPr>
-        <w:pStyle w:val="Paragraphedeliste"/>
-        <w:numPr>
-          <w:ilvl w:val="0"/>
-          <w:numId w:val="1"/>
-        </w:numPr>
-        <w:spacing w:after="80"/>
-        <w:rPr>
-          <w:sz w:val="24"/>
-          <w:szCs w:val="24"/>
-        </w:rPr>
-      </w:pPr>
-      <w:r>
-        <w:rPr>
-          <w:sz w:val="24"/>
-          <w:szCs w:val="24"/>
-        </w:rPr>
+        <w:lastRenderedPageBreak/>
         <w:t>Tableau de bord statistique avancé.</w:t>
       </w:r>
     </w:p>
@@ -743,7 +803,6 @@
           <w:sz w:val="24"/>
           <w:szCs w:val="24"/>
         </w:rPr>
-        <w:lastRenderedPageBreak/>
         <w:t>Utilisateurs types</w:t>
       </w:r>
     </w:p>
@@ -1550,19 +1609,10 @@
       </w:pPr>
       <w:r>
         <w:rPr>
-          <w:b/>
-          <w:bCs/>
-          <w:sz w:val="24"/>
-          <w:szCs w:val="24"/>
-        </w:rPr>
-        <w:t xml:space="preserve">Sécurité : </w:t>
-      </w:r>
-      <w:r>
-        <w:rPr>
-          <w:sz w:val="24"/>
-          <w:szCs w:val="24"/>
-        </w:rPr>
-        <w:t xml:space="preserve">toutes les données envoyées à l'API sont validées côté serveur (règles </w:t>
+          <w:sz w:val="24"/>
+          <w:szCs w:val="24"/>
+        </w:rPr>
+        <w:t>Sécurité : l'accès à l'application est protégé par une authentification (</w:t>
       </w:r>
       <w:proofErr w:type="spellStart"/>
       <w:r>
@@ -1578,6 +1628,68 @@
           <w:sz w:val="24"/>
           <w:szCs w:val="24"/>
         </w:rPr>
+        <w:t xml:space="preserve"> </w:t>
+      </w:r>
+      <w:proofErr w:type="spellStart"/>
+      <w:r>
+        <w:rPr>
+          <w:sz w:val="24"/>
+          <w:szCs w:val="24"/>
+        </w:rPr>
+        <w:t>Sanctum</w:t>
+      </w:r>
+      <w:proofErr w:type="spellEnd"/>
+      <w:r>
+        <w:rPr>
+          <w:sz w:val="24"/>
+          <w:szCs w:val="24"/>
+        </w:rPr>
+        <w:t xml:space="preserve">, </w:t>
+      </w:r>
+      <w:proofErr w:type="spellStart"/>
+      <w:r>
+        <w:rPr>
+          <w:sz w:val="24"/>
+          <w:szCs w:val="24"/>
+        </w:rPr>
+        <w:t>token</w:t>
+      </w:r>
+      <w:proofErr w:type="spellEnd"/>
+      <w:r>
+        <w:rPr>
+          <w:sz w:val="24"/>
+          <w:szCs w:val="24"/>
+        </w:rPr>
+        <w:t xml:space="preserve"> API) </w:t>
+      </w:r>
+      <w:r>
+        <w:rPr>
+          <w:sz w:val="24"/>
+          <w:szCs w:val="24"/>
+        </w:rPr>
+        <w:t>-</w:t>
+      </w:r>
+      <w:r>
+        <w:rPr>
+          <w:sz w:val="24"/>
+          <w:szCs w:val="24"/>
+        </w:rPr>
+        <w:t xml:space="preserve"> seul l'administrateur connecté peut consulter et modifier les données. Toutes les données envoyées à l'API sont en plus validées côté serveur (règles </w:t>
+      </w:r>
+      <w:proofErr w:type="spellStart"/>
+      <w:r>
+        <w:rPr>
+          <w:sz w:val="24"/>
+          <w:szCs w:val="24"/>
+        </w:rPr>
+        <w:t>Laravel</w:t>
+      </w:r>
+      <w:proofErr w:type="spellEnd"/>
+      <w:r>
+        <w:rPr>
+          <w:sz w:val="24"/>
+          <w:szCs w:val="24"/>
+        </w:rPr>
         <w:t xml:space="preserve"> : champs requis, types, longueurs, unicité de l'immatriculation, existence des identifiants liés). Les suppressions en cascade sont gérées au niveau de la base de données pour garantir la cohérence.</w:t>
       </w:r>
     </w:p>
@@ -1667,35 +1779,7 @@
           <w:sz w:val="24"/>
           <w:szCs w:val="24"/>
         </w:rPr>
-        <w:t xml:space="preserve"> / API REST permet de faire évoluer indépendamment les deux parties, et de remplacer</w:t>
-      </w:r>
-      <w:r>
-        <w:rPr>
-          <w:sz w:val="24"/>
-          <w:szCs w:val="24"/>
-        </w:rPr>
-        <w:t xml:space="preserve"> MySQL</w:t>
-      </w:r>
-      <w:r>
-        <w:rPr>
-          <w:sz w:val="24"/>
-          <w:szCs w:val="24"/>
-        </w:rPr>
-        <w:t xml:space="preserve"> par </w:t>
-      </w:r>
-      <w:r>
-        <w:rPr>
-          <w:sz w:val="24"/>
-          <w:szCs w:val="24"/>
-        </w:rPr>
-        <w:t>SQLite</w:t>
-      </w:r>
-      <w:r>
-        <w:rPr>
-          <w:sz w:val="24"/>
-          <w:szCs w:val="24"/>
-        </w:rPr>
-        <w:t xml:space="preserve"> ou PostgreSQL sans changer le code métier.</w:t>
+        <w:t xml:space="preserve"> / API REST permet de faire évoluer indépendamment les deux parties, et de remplacer SQLite par MySQL ou PostgreSQL sans changer le code métier.</w:t>
       </w:r>
     </w:p>
     <w:p>
@@ -1965,21 +2049,55 @@
           <w:sz w:val="24"/>
           <w:szCs w:val="24"/>
         </w:rPr>
-        <w:t xml:space="preserve"> 13 (PHP 8.3), base de données </w:t>
-      </w:r>
-      <w:r>
-        <w:rPr>
-          <w:sz w:val="24"/>
-          <w:szCs w:val="24"/>
-        </w:rPr>
-        <w:t>MySQL</w:t>
-      </w:r>
-      <w:r>
-        <w:rPr>
-          <w:sz w:val="24"/>
-          <w:szCs w:val="24"/>
-        </w:rPr>
-        <w:t xml:space="preserve"> en développement, API REST exposée via des ressources </w:t>
+        <w:t xml:space="preserve"> 13 (PHP 8.4), </w:t>
+      </w:r>
+      <w:proofErr w:type="spellStart"/>
+      <w:r>
+        <w:rPr>
+          <w:sz w:val="24"/>
+          <w:szCs w:val="24"/>
+        </w:rPr>
+        <w:t>Laravel</w:t>
+      </w:r>
+      <w:proofErr w:type="spellEnd"/>
+      <w:r>
+        <w:rPr>
+          <w:sz w:val="24"/>
+          <w:szCs w:val="24"/>
+        </w:rPr>
+        <w:t xml:space="preserve"> </w:t>
+      </w:r>
+      <w:proofErr w:type="spellStart"/>
+      <w:r>
+        <w:rPr>
+          <w:sz w:val="24"/>
+          <w:szCs w:val="24"/>
+        </w:rPr>
+        <w:t>Sanctum</w:t>
+      </w:r>
+      <w:proofErr w:type="spellEnd"/>
+      <w:r>
+        <w:rPr>
+          <w:sz w:val="24"/>
+          <w:szCs w:val="24"/>
+        </w:rPr>
+        <w:t xml:space="preserve"> pour l'authentification par </w:t>
+      </w:r>
+      <w:proofErr w:type="spellStart"/>
+      <w:r>
+        <w:rPr>
+          <w:sz w:val="24"/>
+          <w:szCs w:val="24"/>
+        </w:rPr>
+        <w:t>token</w:t>
+      </w:r>
+      <w:proofErr w:type="spellEnd"/>
+      <w:r>
+        <w:rPr>
+          <w:sz w:val="24"/>
+          <w:szCs w:val="24"/>
+        </w:rPr>
+        <w:t xml:space="preserve"> API, base de données SQLite en développement / PostgreSQL en production, API REST exposée via des ressources </w:t>
       </w:r>
       <w:proofErr w:type="spellStart"/>
       <w:r>
@@ -2020,7 +2138,7 @@
           <w:sz w:val="24"/>
           <w:szCs w:val="24"/>
         </w:rPr>
-        <w:t>).</w:t>
+        <w:t>), conteneurisée avec Docker pour le déploiement.</w:t>
       </w:r>
     </w:p>
     <w:p>
@@ -2129,22 +2247,7 @@
           <w:sz w:val="24"/>
           <w:szCs w:val="24"/>
         </w:rPr>
-        <w:t xml:space="preserve">). L'URL de l'API est paramétrée via la variable d'environnement </w:t>
-      </w:r>
-      <w:r>
-        <w:rPr>
-          <w:color w:val="EE0000"/>
-          <w:sz w:val="24"/>
-          <w:szCs w:val="24"/>
-        </w:rPr>
-        <w:t>VITE_BACKEND_URL</w:t>
-      </w:r>
-      <w:r>
-        <w:rPr>
-          <w:sz w:val="24"/>
-          <w:szCs w:val="24"/>
-        </w:rPr>
-        <w:t>.</w:t>
+        <w:t>). L'URL de l'API est paramétrée via la variable d'environnement VITE_BACKEND_URL.</w:t>
       </w:r>
     </w:p>
     <w:p>
@@ -2411,21 +2514,8 @@
           <w:sz w:val="24"/>
           <w:szCs w:val="24"/>
         </w:rPr>
-        <w:t xml:space="preserve">Le détail des écrans (wireframes) et des parcours utilisateurs est présenté dans le </w:t>
-      </w:r>
-      <w:r>
-        <w:rPr>
-          <w:sz w:val="24"/>
-          <w:szCs w:val="24"/>
-        </w:rPr>
-        <w:t>Dossier de Con</w:t>
-      </w:r>
-      <w:r>
-        <w:rPr>
-          <w:sz w:val="24"/>
-          <w:szCs w:val="24"/>
-        </w:rPr>
-        <w:t>ception Visuelle qui accompagne ce document.</w:t>
+        <w:lastRenderedPageBreak/>
+        <w:t>Le détail des écrans (wireframes) et des parcours utilisateurs est présenté dans le Dossier de Conception Visuelle qui accompagne ce document.</w:t>
       </w:r>
     </w:p>
     <w:p>
@@ -2452,7 +2542,6 @@
           <w:sz w:val="28"/>
           <w:szCs w:val="28"/>
         </w:rPr>
-        <w:lastRenderedPageBreak/>
         <w:t>Flux de Navigation</w:t>
       </w:r>
     </w:p>
@@ -2478,21 +2567,7 @@
           <w:sz w:val="24"/>
           <w:szCs w:val="24"/>
         </w:rPr>
-        <w:t xml:space="preserve">l'utilisateur </w:t>
-      </w:r>
-      <w:r>
-        <w:rPr>
-          <w:sz w:val="24"/>
-          <w:szCs w:val="24"/>
-        </w:rPr>
-        <w:t>va</w:t>
-      </w:r>
-      <w:r>
-        <w:rPr>
-          <w:sz w:val="24"/>
-          <w:szCs w:val="24"/>
-        </w:rPr>
-        <w:t xml:space="preserve"> sur la page Réparations, clique sur « Nouvelle réparation », sélectionne le véhicule concerné et un ou plusieurs techniciens, renseigne la date, la durée de main d'œuvre et l'objet de la réparation, puis clique sur « Enregistrer ». Il est ensuite redirigé vers la liste des réparations.</w:t>
+        <w:t>l'utilisateur se rend sur la page Réparations, clique sur « Nouvelle réparation », sélectionne le véhicule concerné et un ou plusieurs techniciens, renseigne la date, la durée de main d'œuvre et l'objet de la réparation, puis clique sur « Enregistrer ». Il est ensuite redirigé vers la liste des réparations.</w:t>
       </w:r>
     </w:p>
     <w:p>
@@ -2517,21 +2592,7 @@
           <w:sz w:val="24"/>
           <w:szCs w:val="24"/>
         </w:rPr>
-        <w:t>l'utilisateur accède à la page Véhicules et saisit une marque ou une immatriculation dans le champ de recherche</w:t>
-      </w:r>
-      <w:r>
-        <w:rPr>
-          <w:sz w:val="24"/>
-          <w:szCs w:val="24"/>
-        </w:rPr>
-        <w:t>,</w:t>
-      </w:r>
-      <w:r>
-        <w:rPr>
-          <w:sz w:val="24"/>
-          <w:szCs w:val="24"/>
-        </w:rPr>
-        <w:t xml:space="preserve"> la liste se met à jour dynamiquement.</w:t>
+        <w:t>l'utilisateur accède à la page Véhicules et saisit une marque ou une immatriculation dans le champ de recherche ; la liste se met à jour dynamiquement.</w:t>
       </w:r>
     </w:p>
     <w:p>
@@ -2572,21 +2633,7 @@
           <w:sz w:val="24"/>
           <w:szCs w:val="24"/>
         </w:rPr>
-        <w:t xml:space="preserve">Ces parcours sont illustrés sous forme de schémas dans le </w:t>
-      </w:r>
-      <w:r>
-        <w:rPr>
-          <w:sz w:val="24"/>
-          <w:szCs w:val="24"/>
-        </w:rPr>
-        <w:t>Dossier de Con</w:t>
-      </w:r>
-      <w:r>
-        <w:rPr>
-          <w:sz w:val="24"/>
-          <w:szCs w:val="24"/>
-        </w:rPr>
-        <w:t>ception Visuelle.</w:t>
+        <w:t>Ces parcours sont illustrés sous forme de schémas dans le Dossier de Conception Visuelle.</w:t>
       </w:r>
     </w:p>
     <w:p>
@@ -2940,7 +2987,21 @@
           <w:sz w:val="24"/>
           <w:szCs w:val="24"/>
         </w:rPr>
-        <w:t xml:space="preserve"> déjà largement réalisé.</w:t>
+        <w:t xml:space="preserve"> </w:t>
+      </w:r>
+      <w:r>
+        <w:rPr>
+          <w:sz w:val="24"/>
+          <w:szCs w:val="24"/>
+        </w:rPr>
+        <w:t>fait</w:t>
+      </w:r>
+      <w:r>
+        <w:rPr>
+          <w:sz w:val="24"/>
+          <w:szCs w:val="24"/>
+        </w:rPr>
+        <w:t>.</w:t>
       </w:r>
     </w:p>
     <w:p>
@@ -3005,7 +3066,21 @@
           <w:sz w:val="24"/>
           <w:szCs w:val="24"/>
         </w:rPr>
-        <w:t xml:space="preserve"> déjà largement réalisé.</w:t>
+        <w:t xml:space="preserve"> </w:t>
+      </w:r>
+      <w:r>
+        <w:rPr>
+          <w:sz w:val="24"/>
+          <w:szCs w:val="24"/>
+        </w:rPr>
+        <w:t>fait</w:t>
+      </w:r>
+      <w:r>
+        <w:rPr>
+          <w:sz w:val="24"/>
+          <w:szCs w:val="24"/>
+        </w:rPr>
+        <w:t>.</w:t>
       </w:r>
     </w:p>
     <w:p>
@@ -3389,6 +3464,7 @@
           <w:sz w:val="28"/>
           <w:szCs w:val="28"/>
         </w:rPr>
+        <w:lastRenderedPageBreak/>
         <w:t xml:space="preserve"> </w:t>
       </w:r>
       <w:r>
@@ -3417,14 +3493,58 @@
           <w:sz w:val="24"/>
           <w:szCs w:val="24"/>
         </w:rPr>
-        <w:t xml:space="preserve">Environnement : </w:t>
-      </w:r>
-      <w:r>
-        <w:rPr>
-          <w:sz w:val="24"/>
-          <w:szCs w:val="24"/>
-        </w:rPr>
-        <w:t xml:space="preserve">démonstration en local, </w:t>
+        <w:t>Environnement de démonstration :</w:t>
+      </w:r>
+      <w:r>
+        <w:rPr>
+          <w:sz w:val="24"/>
+          <w:szCs w:val="24"/>
+        </w:rPr>
+        <w:t xml:space="preserve"> application déployée publiquement </w:t>
+      </w:r>
+      <w:r>
+        <w:rPr>
+          <w:sz w:val="24"/>
+          <w:szCs w:val="24"/>
+        </w:rPr>
+        <w:t>-</w:t>
+      </w:r>
+      <w:r>
+        <w:rPr>
+          <w:sz w:val="24"/>
+          <w:szCs w:val="24"/>
+        </w:rPr>
+        <w:t xml:space="preserve"> </w:t>
+      </w:r>
+      <w:r>
+        <w:rPr>
+          <w:sz w:val="24"/>
+          <w:szCs w:val="24"/>
+        </w:rPr>
+        <w:t>backend</w:t>
+      </w:r>
+      <w:r>
+        <w:rPr>
+          <w:sz w:val="24"/>
+          <w:szCs w:val="24"/>
+        </w:rPr>
+        <w:t xml:space="preserve"> (API </w:t>
+      </w:r>
+      <w:proofErr w:type="spellStart"/>
+      <w:r>
+        <w:rPr>
+          <w:sz w:val="24"/>
+          <w:szCs w:val="24"/>
+        </w:rPr>
+        <w:t>Laravel</w:t>
+      </w:r>
+      <w:proofErr w:type="spellEnd"/>
+      <w:r>
+        <w:rPr>
+          <w:sz w:val="24"/>
+          <w:szCs w:val="24"/>
+        </w:rPr>
+        <w:t xml:space="preserve">) hébergé sur Render, </w:t>
       </w:r>
       <w:r>
         <w:rPr>
@@ -3438,7 +3558,94 @@
           <w:sz w:val="24"/>
           <w:szCs w:val="24"/>
         </w:rPr>
-        <w:t xml:space="preserve"> et </w:t>
+        <w:t xml:space="preserve"> (</w:t>
+      </w:r>
+      <w:proofErr w:type="spellStart"/>
+      <w:r>
+        <w:rPr>
+          <w:sz w:val="24"/>
+          <w:szCs w:val="24"/>
+        </w:rPr>
+        <w:t>React</w:t>
+      </w:r>
+      <w:proofErr w:type="spellEnd"/>
+      <w:r>
+        <w:rPr>
+          <w:sz w:val="24"/>
+          <w:szCs w:val="24"/>
+        </w:rPr>
+        <w:t xml:space="preserve">) hébergé sur </w:t>
+      </w:r>
+      <w:proofErr w:type="spellStart"/>
+      <w:r>
+        <w:rPr>
+          <w:sz w:val="24"/>
+          <w:szCs w:val="24"/>
+        </w:rPr>
+        <w:t>Netlify</w:t>
+      </w:r>
+      <w:proofErr w:type="spellEnd"/>
+      <w:r>
+        <w:rPr>
+          <w:sz w:val="24"/>
+          <w:szCs w:val="24"/>
+        </w:rPr>
+        <w:t>. Les deux services communiquent via l'API REST, avec CORS ouvert sur les routes /api/*.</w:t>
+      </w:r>
+    </w:p>
+    <w:p>
+      <w:pPr>
+        <w:spacing w:after="120"/>
+        <w:rPr>
+          <w:sz w:val="24"/>
+          <w:szCs w:val="24"/>
+        </w:rPr>
+      </w:pPr>
+      <w:r>
+        <w:rPr>
+          <w:b/>
+          <w:bCs/>
+          <w:sz w:val="24"/>
+          <w:szCs w:val="24"/>
+        </w:rPr>
+        <w:t xml:space="preserve">Prérequis techniques : </w:t>
+      </w:r>
+      <w:r>
+        <w:rPr>
+          <w:sz w:val="24"/>
+          <w:szCs w:val="24"/>
+        </w:rPr>
+        <w:t xml:space="preserve">Node.js et </w:t>
+      </w:r>
+      <w:proofErr w:type="spellStart"/>
+      <w:r>
+        <w:rPr>
+          <w:sz w:val="24"/>
+          <w:szCs w:val="24"/>
+        </w:rPr>
+        <w:t>npm</w:t>
+      </w:r>
+      <w:proofErr w:type="spellEnd"/>
+      <w:r>
+        <w:rPr>
+          <w:sz w:val="24"/>
+          <w:szCs w:val="24"/>
+        </w:rPr>
+        <w:t xml:space="preserve"> (</w:t>
+      </w:r>
+      <w:r>
+        <w:rPr>
+          <w:sz w:val="24"/>
+          <w:szCs w:val="24"/>
+        </w:rPr>
+        <w:t>frontend</w:t>
+      </w:r>
+      <w:r>
+        <w:rPr>
+          <w:sz w:val="24"/>
+          <w:szCs w:val="24"/>
+        </w:rPr>
+        <w:t xml:space="preserve">), PHP 8.4, Composer, extension SQLite (dev) ou PostgreSQL (production), Docker pour le déploiement du </w:t>
       </w:r>
       <w:r>
         <w:rPr>
@@ -3452,68 +3659,48 @@
           <w:sz w:val="24"/>
           <w:szCs w:val="24"/>
         </w:rPr>
-        <w:t xml:space="preserve"> lancés séparément (Vite d'un côté, </w:t>
-      </w:r>
-      <w:proofErr w:type="spellStart"/>
-      <w:r>
-        <w:rPr>
-          <w:sz w:val="24"/>
-          <w:szCs w:val="24"/>
-        </w:rPr>
-        <w:t>Laravel</w:t>
-      </w:r>
-      <w:proofErr w:type="spellEnd"/>
-      <w:r>
-        <w:rPr>
-          <w:sz w:val="24"/>
-          <w:szCs w:val="24"/>
-        </w:rPr>
-        <w:t xml:space="preserve"> de l'autre).</w:t>
-      </w:r>
-    </w:p>
-    <w:p>
-      <w:pPr>
-        <w:spacing w:after="120"/>
-        <w:rPr>
-          <w:sz w:val="24"/>
-          <w:szCs w:val="24"/>
-        </w:rPr>
-      </w:pPr>
-      <w:r>
-        <w:rPr>
-          <w:b/>
-          <w:bCs/>
-          <w:sz w:val="24"/>
-          <w:szCs w:val="24"/>
-        </w:rPr>
-        <w:lastRenderedPageBreak/>
-        <w:t xml:space="preserve">Prérequis techniques : </w:t>
-      </w:r>
-      <w:r>
-        <w:rPr>
-          <w:sz w:val="24"/>
-          <w:szCs w:val="24"/>
-        </w:rPr>
-        <w:t xml:space="preserve">Node.js et </w:t>
-      </w:r>
-      <w:proofErr w:type="spellStart"/>
-      <w:r>
-        <w:rPr>
-          <w:sz w:val="24"/>
-          <w:szCs w:val="24"/>
-        </w:rPr>
-        <w:t>npm</w:t>
-      </w:r>
-      <w:proofErr w:type="spellEnd"/>
-      <w:r>
-        <w:rPr>
-          <w:sz w:val="24"/>
-          <w:szCs w:val="24"/>
-        </w:rPr>
-        <w:t xml:space="preserve"> (</w:t>
-      </w:r>
-      <w:r>
-        <w:rPr>
+        <w:t>.</w:t>
+      </w:r>
+    </w:p>
+    <w:p>
+      <w:pPr>
+        <w:rPr>
+          <w:b/>
+          <w:bCs/>
+          <w:sz w:val="24"/>
+          <w:szCs w:val="24"/>
+        </w:rPr>
+      </w:pPr>
+      <w:r>
+        <w:rPr>
+          <w:b/>
+          <w:bCs/>
+          <w:sz w:val="24"/>
+          <w:szCs w:val="24"/>
+        </w:rPr>
+        <w:t>Liens de démonstration :</w:t>
+      </w:r>
+    </w:p>
+    <w:p>
+      <w:pPr>
+        <w:rPr>
+          <w:sz w:val="24"/>
+          <w:szCs w:val="24"/>
+        </w:rPr>
+      </w:pPr>
+      <w:r>
+        <w:rPr>
+          <w:b/>
+          <w:bCs/>
+          <w:sz w:val="24"/>
+          <w:szCs w:val="24"/>
+        </w:rPr>
+        <w:t>Application (</w:t>
+      </w:r>
+      <w:r>
+        <w:rPr>
+          <w:b/>
+          <w:bCs/>
           <w:sz w:val="24"/>
           <w:szCs w:val="24"/>
         </w:rPr>
@@ -3521,27 +3708,41 @@
       </w:r>
       <w:r>
         <w:rPr>
-          <w:sz w:val="24"/>
-          <w:szCs w:val="24"/>
-        </w:rPr>
-        <w:t xml:space="preserve">), PHP 8.3, Composer et l'extension </w:t>
-      </w:r>
-      <w:r>
-        <w:rPr>
-          <w:sz w:val="24"/>
-          <w:szCs w:val="24"/>
-        </w:rPr>
-        <w:t>MySQL</w:t>
-      </w:r>
-      <w:r>
-        <w:rPr>
-          <w:sz w:val="24"/>
-          <w:szCs w:val="24"/>
-        </w:rPr>
-        <w:t xml:space="preserve"> (</w:t>
-      </w:r>
-      <w:r>
-        <w:rPr>
+          <w:b/>
+          <w:bCs/>
+          <w:sz w:val="24"/>
+          <w:szCs w:val="24"/>
+        </w:rPr>
+        <w:t>) :</w:t>
+      </w:r>
+      <w:r>
+        <w:rPr>
+          <w:sz w:val="24"/>
+          <w:szCs w:val="24"/>
+        </w:rPr>
+        <w:t xml:space="preserve"> https://mini-garage.netlify.app/</w:t>
+      </w:r>
+    </w:p>
+    <w:p>
+      <w:pPr>
+        <w:rPr>
+          <w:sz w:val="24"/>
+          <w:szCs w:val="24"/>
+        </w:rPr>
+      </w:pPr>
+      <w:r>
+        <w:rPr>
+          <w:b/>
+          <w:bCs/>
+          <w:sz w:val="24"/>
+          <w:szCs w:val="24"/>
+        </w:rPr>
+        <w:t>API (</w:t>
+      </w:r>
+      <w:r>
+        <w:rPr>
+          <w:b/>
+          <w:bCs/>
           <w:sz w:val="24"/>
           <w:szCs w:val="24"/>
         </w:rPr>
@@ -3549,10 +3750,36 @@
       </w:r>
       <w:r>
         <w:rPr>
-          <w:sz w:val="24"/>
-          <w:szCs w:val="24"/>
-        </w:rPr>
-        <w:t>).</w:t>
+          <w:b/>
+          <w:bCs/>
+          <w:sz w:val="24"/>
+          <w:szCs w:val="24"/>
+        </w:rPr>
+        <w:t>) :</w:t>
+      </w:r>
+      <w:r>
+        <w:rPr>
+          <w:sz w:val="24"/>
+          <w:szCs w:val="24"/>
+        </w:rPr>
+        <w:t xml:space="preserve"> https://mini-garage-api-o7m5.onrender.com/</w:t>
+      </w:r>
+    </w:p>
+    <w:p>
+      <w:pPr>
+        <w:rPr>
+          <w:sz w:val="24"/>
+          <w:szCs w:val="24"/>
+        </w:rPr>
+      </w:pPr>
+      <w:r>
+        <w:rPr>
+          <w:b/>
+          <w:bCs/>
+          <w:sz w:val="24"/>
+          <w:szCs w:val="24"/>
+        </w:rPr>
+        <w:t xml:space="preserve">Présentation vidéo : </w:t>
       </w:r>
     </w:p>
     <w:p>

</xml_diff>